<commit_message>
fix: english lang subtitles
</commit_message>
<xml_diff>
--- a/DiD_Results.docx
+++ b/DiD_Results.docx
@@ -26,9 +26,9 @@
         <w:br/>
         <w:t>Method:                 Least Squares   F-statistic:                     81.41</w:t>
         <w:br/>
-        <w:t>Date:                Sat, 24 Jan 2026   Prob (F-statistic):           1.53e-07</w:t>
+        <w:t>Date:                Tue, 19 May 2026   Prob (F-statistic):           1.53e-07</w:t>
         <w:br/>
-        <w:t>Time:                        15:16:05   Log-Likelihood:                 111.24</w:t>
+        <w:t>Time:                        16:05:56   Log-Likelihood:                 111.24</w:t>
         <w:br/>
         <w:t>No. Observations:                 220   AIC:                            -176.5</w:t>
         <w:br/>

</xml_diff>